<commit_message>
feat: Implement delete functionality for quizzes
</commit_message>
<xml_diff>
--- a/graduation-thesis/QAI_Graduation_Thesis.docx
+++ b/graduation-thesis/QAI_Graduation_Thesis.docx
@@ -7029,6 +7029,46 @@
     </w:p>
     <w:p>
       <w:pPr>
+        <w:jc w:val="center"/>
+      </w:pPr>
+      <w:r>
+        <w:drawing>
+          <wp:inline xmlns:a="http://schemas.openxmlformats.org/drawingml/2006/main" xmlns:pic="http://schemas.openxmlformats.org/drawingml/2006/picture">
+            <wp:extent cx="5303520" cy="459843"/>
+            <wp:docPr id="1" name="Picture 1"/>
+            <wp:cNvGraphicFramePr>
+              <a:graphicFrameLocks noChangeAspect="1"/>
+            </wp:cNvGraphicFramePr>
+            <a:graphic>
+              <a:graphicData uri="http://schemas.openxmlformats.org/drawingml/2006/picture">
+                <pic:pic>
+                  <pic:nvPicPr>
+                    <pic:cNvPr id="0" name="07-use-case.png"/>
+                    <pic:cNvPicPr/>
+                  </pic:nvPicPr>
+                  <pic:blipFill>
+                    <a:blip r:embed="rId9"/>
+                    <a:stretch>
+                      <a:fillRect/>
+                    </a:stretch>
+                  </pic:blipFill>
+                  <pic:spPr>
+                    <a:xfrm>
+                      <a:off x="0" y="0"/>
+                      <a:ext cx="5303520" cy="459843"/>
+                    </a:xfrm>
+                    <a:prstGeom prst="rect"/>
+                  </pic:spPr>
+                </pic:pic>
+              </a:graphicData>
+            </a:graphic>
+          </wp:inline>
+        </w:drawing>
+      </w:r>
+    </w:p>
+    <w:p/>
+    <w:p>
+      <w:pPr>
         <w:pStyle w:val="Heading3"/>
       </w:pPr>
       <w:r>
@@ -7391,6 +7431,46 @@
         <w:t>3.5 System Context Diagram</w:t>
       </w:r>
     </w:p>
+    <w:p>
+      <w:pPr>
+        <w:jc w:val="center"/>
+      </w:pPr>
+      <w:r>
+        <w:drawing>
+          <wp:inline xmlns:a="http://schemas.openxmlformats.org/drawingml/2006/main" xmlns:pic="http://schemas.openxmlformats.org/drawingml/2006/picture">
+            <wp:extent cx="5303520" cy="8697052"/>
+            <wp:docPr id="2" name="Picture 2"/>
+            <wp:cNvGraphicFramePr>
+              <a:graphicFrameLocks noChangeAspect="1"/>
+            </wp:cNvGraphicFramePr>
+            <a:graphic>
+              <a:graphicData uri="http://schemas.openxmlformats.org/drawingml/2006/picture">
+                <pic:pic>
+                  <pic:nvPicPr>
+                    <pic:cNvPr id="0" name="08-c4-context.png"/>
+                    <pic:cNvPicPr/>
+                  </pic:nvPicPr>
+                  <pic:blipFill>
+                    <a:blip r:embed="rId10"/>
+                    <a:stretch>
+                      <a:fillRect/>
+                    </a:stretch>
+                  </pic:blipFill>
+                  <pic:spPr>
+                    <a:xfrm>
+                      <a:off x="0" y="0"/>
+                      <a:ext cx="5303520" cy="8697052"/>
+                    </a:xfrm>
+                    <a:prstGeom prst="rect"/>
+                  </pic:spPr>
+                </pic:pic>
+              </a:graphicData>
+            </a:graphic>
+          </wp:inline>
+        </w:drawing>
+      </w:r>
+    </w:p>
+    <w:p/>
     <w:p>
       <w:pPr>
         <w:pStyle w:val="NoSpacing"/>
@@ -7867,60 +7947,44 @@
     <w:p/>
     <w:p>
       <w:pPr>
-        <w:pStyle w:val="NoSpacing"/>
-        <w:spacing w:before="40" w:after="40"/>
-        <w:ind w:left="567"/>
-      </w:pPr>
-      <w:r>
-        <w:rPr>
-          <w:rFonts w:ascii="Consolas" w:hAnsi="Consolas"/>
-          <w:color w:val="1E1E1E"/>
-          <w:sz w:val="17"/>
-          <w:shd w:val="clear" w:fill="F5F5F5"/>
-        </w:rPr>
-        <w:t>┌─────────────────────────────────────────────────────────────────┐</w:t>
-        <w:br/>
-        <w:t>│                        CLIENT (Browser)                          │</w:t>
-        <w:br/>
-        <w:t>│  Next.js Pages • React Components • Zustand Store • PWA SW      │</w:t>
-        <w:br/>
-        <w:t>└───────────────┬──────────────────┬──────────────────────────────┘</w:t>
-        <w:br/>
-        <w:t xml:space="preserve">                │ HTTP              │ WebSocket</w:t>
-        <w:br/>
-        <w:t xml:space="preserve">    ┌───────────▼─────────┐   ┌────▼─────────────────────────┐</w:t>
-        <w:br/>
-        <w:t xml:space="preserve">    │  Next.js BFF Routes │   │  AI Study Coach (FastAPI)     │</w:t>
-        <w:br/>
-        <w:t xml:space="preserve">    │  /api/coach/*       │   │  /ws/coach                    │</w:t>
-        <w:br/>
-        <w:t xml:space="preserve">    │  /api/quiz/*        │   │  /ingest, /generate, /webhook │</w:t>
-        <w:br/>
-        <w:t xml:space="preserve">    └───────────┬─────────┘   └────┬────────┬────────────────┘</w:t>
-        <w:br/>
-        <w:t xml:space="preserve">                │ HTTP              │ HTTP   │ Embedding API</w:t>
-        <w:br/>
-        <w:t xml:space="preserve">    ┌───────────▼─────────┐   ┌────▼────┐  ┌▼────────────────┐</w:t>
-        <w:br/>
-        <w:t xml:space="preserve">    │  Spring Boot API    │   │Supabase │  │   LM Studio     │</w:t>
-        <w:br/>
-        <w:t xml:space="preserve">    │  /quiz, /question,  │   │pgvector │  │   (local LLM)   │</w:t>
-        <w:br/>
-        <w:t xml:space="preserve">    │  /take-quiz, etc.   │   └─────────┘  └─────────────────┘</w:t>
-        <w:br/>
-        <w:t xml:space="preserve">    └───────────┬─────────┘                        │</w:t>
-        <w:br/>
-        <w:t xml:space="preserve">                │ Firestore SDK                    ┌▼──────────┐</w:t>
-        <w:br/>
-        <w:t xml:space="preserve">    ┌───────────▼─────────┐                       │ DeepSeek  │</w:t>
-        <w:br/>
-        <w:t xml:space="preserve">    │  Google Firestore   │                       │ (cloud)   │</w:t>
-        <w:br/>
-        <w:t xml:space="preserve">    │  (NoSQL Database)   │                       └───────────┘</w:t>
-        <w:br/>
-        <w:t xml:space="preserve">    └─────────────────────┘</w:t>
-      </w:r>
-    </w:p>
+        <w:jc w:val="center"/>
+      </w:pPr>
+      <w:r>
+        <w:drawing>
+          <wp:inline xmlns:a="http://schemas.openxmlformats.org/drawingml/2006/main" xmlns:pic="http://schemas.openxmlformats.org/drawingml/2006/picture">
+            <wp:extent cx="5029200" cy="4631334"/>
+            <wp:docPr id="3" name="Picture 3"/>
+            <wp:cNvGraphicFramePr>
+              <a:graphicFrameLocks noChangeAspect="1"/>
+            </wp:cNvGraphicFramePr>
+            <a:graphic>
+              <a:graphicData uri="http://schemas.openxmlformats.org/drawingml/2006/picture">
+                <pic:pic>
+                  <pic:nvPicPr>
+                    <pic:cNvPr id="0" name="06-system-overview.png"/>
+                    <pic:cNvPicPr/>
+                  </pic:nvPicPr>
+                  <pic:blipFill>
+                    <a:blip r:embed="rId11"/>
+                    <a:stretch>
+                      <a:fillRect/>
+                    </a:stretch>
+                  </pic:blipFill>
+                  <pic:spPr>
+                    <a:xfrm>
+                      <a:off x="0" y="0"/>
+                      <a:ext cx="5029200" cy="4631334"/>
+                    </a:xfrm>
+                    <a:prstGeom prst="rect"/>
+                  </pic:spPr>
+                </pic:pic>
+              </a:graphicData>
+            </a:graphic>
+          </wp:inline>
+        </w:drawing>
+      </w:r>
+    </w:p>
+    <w:p/>
     <w:p>
       <w:pPr>
         <w:pStyle w:val="Heading2"/>
@@ -7929,6 +7993,46 @@
         <w:t>4.2 Service Responsibilities</w:t>
       </w:r>
     </w:p>
+    <w:p>
+      <w:pPr>
+        <w:jc w:val="center"/>
+      </w:pPr>
+      <w:r>
+        <w:drawing>
+          <wp:inline xmlns:a="http://schemas.openxmlformats.org/drawingml/2006/main" xmlns:pic="http://schemas.openxmlformats.org/drawingml/2006/picture">
+            <wp:extent cx="5303520" cy="10281944"/>
+            <wp:docPr id="4" name="Picture 4"/>
+            <wp:cNvGraphicFramePr>
+              <a:graphicFrameLocks noChangeAspect="1"/>
+            </wp:cNvGraphicFramePr>
+            <a:graphic>
+              <a:graphicData uri="http://schemas.openxmlformats.org/drawingml/2006/picture">
+                <pic:pic>
+                  <pic:nvPicPr>
+                    <pic:cNvPr id="0" name="09-c4-container.png"/>
+                    <pic:cNvPicPr/>
+                  </pic:nvPicPr>
+                  <pic:blipFill>
+                    <a:blip r:embed="rId12"/>
+                    <a:stretch>
+                      <a:fillRect/>
+                    </a:stretch>
+                  </pic:blipFill>
+                  <pic:spPr>
+                    <a:xfrm>
+                      <a:off x="0" y="0"/>
+                      <a:ext cx="5303520" cy="10281944"/>
+                    </a:xfrm>
+                    <a:prstGeom prst="rect"/>
+                  </pic:spPr>
+                </pic:pic>
+              </a:graphicData>
+            </a:graphic>
+          </wp:inline>
+        </w:drawing>
+      </w:r>
+    </w:p>
+    <w:p/>
     <w:p>
       <w:pPr>
         <w:pStyle w:val="Heading3"/>
@@ -8834,6 +8938,46 @@
     </w:p>
     <w:p>
       <w:pPr>
+        <w:jc w:val="center"/>
+      </w:pPr>
+      <w:r>
+        <w:drawing>
+          <wp:inline xmlns:a="http://schemas.openxmlformats.org/drawingml/2006/main" xmlns:pic="http://schemas.openxmlformats.org/drawingml/2006/picture">
+            <wp:extent cx="5303520" cy="3728558"/>
+            <wp:docPr id="5" name="Picture 5"/>
+            <wp:cNvGraphicFramePr>
+              <a:graphicFrameLocks noChangeAspect="1"/>
+            </wp:cNvGraphicFramePr>
+            <a:graphic>
+              <a:graphicData uri="http://schemas.openxmlformats.org/drawingml/2006/picture">
+                <pic:pic>
+                  <pic:nvPicPr>
+                    <pic:cNvPr id="0" name="11-auth-sequence.png"/>
+                    <pic:cNvPicPr/>
+                  </pic:nvPicPr>
+                  <pic:blipFill>
+                    <a:blip r:embed="rId13"/>
+                    <a:stretch>
+                      <a:fillRect/>
+                    </a:stretch>
+                  </pic:blipFill>
+                  <pic:spPr>
+                    <a:xfrm>
+                      <a:off x="0" y="0"/>
+                      <a:ext cx="5303520" cy="3728558"/>
+                    </a:xfrm>
+                    <a:prstGeom prst="rect"/>
+                  </pic:spPr>
+                </pic:pic>
+              </a:graphicData>
+            </a:graphic>
+          </wp:inline>
+        </w:drawing>
+      </w:r>
+    </w:p>
+    <w:p/>
+    <w:p>
+      <w:pPr>
         <w:pStyle w:val="Heading3"/>
       </w:pPr>
       <w:r>
@@ -9006,6 +9150,46 @@
         <w:t>4.6 Deployment Architecture</w:t>
       </w:r>
     </w:p>
+    <w:p>
+      <w:pPr>
+        <w:jc w:val="center"/>
+      </w:pPr>
+      <w:r>
+        <w:drawing>
+          <wp:inline xmlns:a="http://schemas.openxmlformats.org/drawingml/2006/main" xmlns:pic="http://schemas.openxmlformats.org/drawingml/2006/picture">
+            <wp:extent cx="5303520" cy="2893177"/>
+            <wp:docPr id="6" name="Picture 6"/>
+            <wp:cNvGraphicFramePr>
+              <a:graphicFrameLocks noChangeAspect="1"/>
+            </wp:cNvGraphicFramePr>
+            <a:graphic>
+              <a:graphicData uri="http://schemas.openxmlformats.org/drawingml/2006/picture">
+                <pic:pic>
+                  <pic:nvPicPr>
+                    <pic:cNvPr id="0" name="10-deployment.png"/>
+                    <pic:cNvPicPr/>
+                  </pic:nvPicPr>
+                  <pic:blipFill>
+                    <a:blip r:embed="rId14"/>
+                    <a:stretch>
+                      <a:fillRect/>
+                    </a:stretch>
+                  </pic:blipFill>
+                  <pic:spPr>
+                    <a:xfrm>
+                      <a:off x="0" y="0"/>
+                      <a:ext cx="5303520" cy="2893177"/>
+                    </a:xfrm>
+                    <a:prstGeom prst="rect"/>
+                  </pic:spPr>
+                </pic:pic>
+              </a:graphicData>
+            </a:graphic>
+          </wp:inline>
+        </w:drawing>
+      </w:r>
+    </w:p>
+    <w:p/>
     <w:p>
       <w:pPr>
         <w:pStyle w:val="NoSpacing"/>
@@ -9340,6 +9524,46 @@
         <w:t>4.8 Database Design</w:t>
       </w:r>
     </w:p>
+    <w:p>
+      <w:pPr>
+        <w:jc w:val="center"/>
+      </w:pPr>
+      <w:r>
+        <w:drawing>
+          <wp:inline xmlns:a="http://schemas.openxmlformats.org/drawingml/2006/main" xmlns:pic="http://schemas.openxmlformats.org/drawingml/2006/picture">
+            <wp:extent cx="5303520" cy="4372338"/>
+            <wp:docPr id="7" name="Picture 7"/>
+            <wp:cNvGraphicFramePr>
+              <a:graphicFrameLocks noChangeAspect="1"/>
+            </wp:cNvGraphicFramePr>
+            <a:graphic>
+              <a:graphicData uri="http://schemas.openxmlformats.org/drawingml/2006/picture">
+                <pic:pic>
+                  <pic:nvPicPr>
+                    <pic:cNvPr id="0" name="12-er-diagram.png"/>
+                    <pic:cNvPicPr/>
+                  </pic:nvPicPr>
+                  <pic:blipFill>
+                    <a:blip r:embed="rId15"/>
+                    <a:stretch>
+                      <a:fillRect/>
+                    </a:stretch>
+                  </pic:blipFill>
+                  <pic:spPr>
+                    <a:xfrm>
+                      <a:off x="0" y="0"/>
+                      <a:ext cx="5303520" cy="4372338"/>
+                    </a:xfrm>
+                    <a:prstGeom prst="rect"/>
+                  </pic:spPr>
+                </pic:pic>
+              </a:graphicData>
+            </a:graphic>
+          </wp:inline>
+        </w:drawing>
+      </w:r>
+    </w:p>
+    <w:p/>
     <w:p>
       <w:pPr>
         <w:pStyle w:val="Heading3"/>
@@ -16284,6 +16508,46 @@
         <w:t>4.11 AI Coach Architecture</w:t>
       </w:r>
     </w:p>
+    <w:p>
+      <w:pPr>
+        <w:jc w:val="center"/>
+      </w:pPr>
+      <w:r>
+        <w:drawing>
+          <wp:inline xmlns:a="http://schemas.openxmlformats.org/drawingml/2006/main" xmlns:pic="http://schemas.openxmlformats.org/drawingml/2006/picture">
+            <wp:extent cx="5303520" cy="7116067"/>
+            <wp:docPr id="8" name="Picture 8"/>
+            <wp:cNvGraphicFramePr>
+              <a:graphicFrameLocks noChangeAspect="1"/>
+            </wp:cNvGraphicFramePr>
+            <a:graphic>
+              <a:graphicData uri="http://schemas.openxmlformats.org/drawingml/2006/picture">
+                <pic:pic>
+                  <pic:nvPicPr>
+                    <pic:cNvPr id="0" name="13-ai-coach-component.png"/>
+                    <pic:cNvPicPr/>
+                  </pic:nvPicPr>
+                  <pic:blipFill>
+                    <a:blip r:embed="rId16"/>
+                    <a:stretch>
+                      <a:fillRect/>
+                    </a:stretch>
+                  </pic:blipFill>
+                  <pic:spPr>
+                    <a:xfrm>
+                      <a:off x="0" y="0"/>
+                      <a:ext cx="5303520" cy="7116067"/>
+                    </a:xfrm>
+                    <a:prstGeom prst="rect"/>
+                  </pic:spPr>
+                </pic:pic>
+              </a:graphicData>
+            </a:graphic>
+          </wp:inline>
+        </w:drawing>
+      </w:r>
+    </w:p>
+    <w:p/>
     <w:p>
       <w:r>
         <w:t>The AI Study Coach follows a layered design separating protocol handling, routing, capability execution, and tool invocation:</w:t>
@@ -17504,6 +17768,46 @@
     </w:p>
     <w:p>
       <w:pPr>
+        <w:jc w:val="center"/>
+      </w:pPr>
+      <w:r>
+        <w:drawing>
+          <wp:inline xmlns:a="http://schemas.openxmlformats.org/drawingml/2006/main" xmlns:pic="http://schemas.openxmlformats.org/drawingml/2006/picture">
+            <wp:extent cx="5303520" cy="15544057"/>
+            <wp:docPr id="9" name="Picture 9"/>
+            <wp:cNvGraphicFramePr>
+              <a:graphicFrameLocks noChangeAspect="1"/>
+            </wp:cNvGraphicFramePr>
+            <a:graphic>
+              <a:graphicData uri="http://schemas.openxmlformats.org/drawingml/2006/picture">
+                <pic:pic>
+                  <pic:nvPicPr>
+                    <pic:cNvPr id="0" name="14-ingestion-activity.png"/>
+                    <pic:cNvPicPr/>
+                  </pic:nvPicPr>
+                  <pic:blipFill>
+                    <a:blip r:embed="rId17"/>
+                    <a:stretch>
+                      <a:fillRect/>
+                    </a:stretch>
+                  </pic:blipFill>
+                  <pic:spPr>
+                    <a:xfrm>
+                      <a:off x="0" y="0"/>
+                      <a:ext cx="5303520" cy="15544057"/>
+                    </a:xfrm>
+                    <a:prstGeom prst="rect"/>
+                  </pic:spPr>
+                </pic:pic>
+              </a:graphicData>
+            </a:graphic>
+          </wp:inline>
+        </w:drawing>
+      </w:r>
+    </w:p>
+    <w:p/>
+    <w:p>
+      <w:pPr>
         <w:pStyle w:val="Heading3"/>
       </w:pPr>
       <w:r>
@@ -17733,6 +18037,46 @@
         <w:t>4.13 Spaced Repetition Algorithm</w:t>
       </w:r>
     </w:p>
+    <w:p>
+      <w:pPr>
+        <w:jc w:val="center"/>
+      </w:pPr>
+      <w:r>
+        <w:drawing>
+          <wp:inline xmlns:a="http://schemas.openxmlformats.org/drawingml/2006/main" xmlns:pic="http://schemas.openxmlformats.org/drawingml/2006/picture">
+            <wp:extent cx="5303520" cy="12046157"/>
+            <wp:docPr id="10" name="Picture 10"/>
+            <wp:cNvGraphicFramePr>
+              <a:graphicFrameLocks noChangeAspect="1"/>
+            </wp:cNvGraphicFramePr>
+            <a:graphic>
+              <a:graphicData uri="http://schemas.openxmlformats.org/drawingml/2006/picture">
+                <pic:pic>
+                  <pic:nvPicPr>
+                    <pic:cNvPr id="0" name="16-sm2-activity.png"/>
+                    <pic:cNvPicPr/>
+                  </pic:nvPicPr>
+                  <pic:blipFill>
+                    <a:blip r:embed="rId18"/>
+                    <a:stretch>
+                      <a:fillRect/>
+                    </a:stretch>
+                  </pic:blipFill>
+                  <pic:spPr>
+                    <a:xfrm>
+                      <a:off x="0" y="0"/>
+                      <a:ext cx="5303520" cy="12046157"/>
+                    </a:xfrm>
+                    <a:prstGeom prst="rect"/>
+                  </pic:spPr>
+                </pic:pic>
+              </a:graphicData>
+            </a:graphic>
+          </wp:inline>
+        </w:drawing>
+      </w:r>
+    </w:p>
+    <w:p/>
     <w:p>
       <w:pPr>
         <w:pStyle w:val="Heading3"/>
@@ -18440,6 +18784,46 @@
     </w:p>
     <w:p>
       <w:pPr>
+        <w:jc w:val="center"/>
+      </w:pPr>
+      <w:r>
+        <w:drawing>
+          <wp:inline xmlns:a="http://schemas.openxmlformats.org/drawingml/2006/main" xmlns:pic="http://schemas.openxmlformats.org/drawingml/2006/picture">
+            <wp:extent cx="5303520" cy="15167161"/>
+            <wp:docPr id="11" name="Picture 11"/>
+            <wp:cNvGraphicFramePr>
+              <a:graphicFrameLocks noChangeAspect="1"/>
+            </wp:cNvGraphicFramePr>
+            <a:graphic>
+              <a:graphicData uri="http://schemas.openxmlformats.org/drawingml/2006/picture">
+                <pic:pic>
+                  <pic:nvPicPr>
+                    <pic:cNvPr id="0" name="19-question-generation-flow.png"/>
+                    <pic:cNvPicPr/>
+                  </pic:nvPicPr>
+                  <pic:blipFill>
+                    <a:blip r:embed="rId19"/>
+                    <a:stretch>
+                      <a:fillRect/>
+                    </a:stretch>
+                  </pic:blipFill>
+                  <pic:spPr>
+                    <a:xfrm>
+                      <a:off x="0" y="0"/>
+                      <a:ext cx="5303520" cy="15167161"/>
+                    </a:xfrm>
+                    <a:prstGeom prst="rect"/>
+                  </pic:spPr>
+                </pic:pic>
+              </a:graphicData>
+            </a:graphic>
+          </wp:inline>
+        </w:drawing>
+      </w:r>
+    </w:p>
+    <w:p/>
+    <w:p>
+      <w:pPr>
         <w:pStyle w:val="Heading3"/>
       </w:pPr>
       <w:r>
@@ -19263,6 +19647,46 @@
     </w:p>
     <w:p>
       <w:pPr>
+        <w:jc w:val="center"/>
+      </w:pPr>
+      <w:r>
+        <w:drawing>
+          <wp:inline xmlns:a="http://schemas.openxmlformats.org/drawingml/2006/main" xmlns:pic="http://schemas.openxmlformats.org/drawingml/2006/picture">
+            <wp:extent cx="5303520" cy="3755383"/>
+            <wp:docPr id="12" name="Picture 12"/>
+            <wp:cNvGraphicFramePr>
+              <a:graphicFrameLocks noChangeAspect="1"/>
+            </wp:cNvGraphicFramePr>
+            <a:graphic>
+              <a:graphicData uri="http://schemas.openxmlformats.org/drawingml/2006/picture">
+                <pic:pic>
+                  <pic:nvPicPr>
+                    <pic:cNvPr id="0" name="18-spring-component.png"/>
+                    <pic:cNvPicPr/>
+                  </pic:nvPicPr>
+                  <pic:blipFill>
+                    <a:blip r:embed="rId20"/>
+                    <a:stretch>
+                      <a:fillRect/>
+                    </a:stretch>
+                  </pic:blipFill>
+                  <pic:spPr>
+                    <a:xfrm>
+                      <a:off x="0" y="0"/>
+                      <a:ext cx="5303520" cy="3755383"/>
+                    </a:xfrm>
+                    <a:prstGeom prst="rect"/>
+                  </pic:spPr>
+                </pic:pic>
+              </a:graphicData>
+            </a:graphic>
+          </wp:inline>
+        </w:drawing>
+      </w:r>
+    </w:p>
+    <w:p/>
+    <w:p>
+      <w:pPr>
         <w:pStyle w:val="NoSpacing"/>
         <w:spacing w:before="40" w:after="40"/>
         <w:ind w:left="567"/>
@@ -19544,6 +19968,46 @@
         <w:t>5.5 Webhook Integration</w:t>
       </w:r>
     </w:p>
+    <w:p>
+      <w:pPr>
+        <w:jc w:val="center"/>
+      </w:pPr>
+      <w:r>
+        <w:drawing>
+          <wp:inline xmlns:a="http://schemas.openxmlformats.org/drawingml/2006/main" xmlns:pic="http://schemas.openxmlformats.org/drawingml/2006/picture">
+            <wp:extent cx="5303520" cy="5004622"/>
+            <wp:docPr id="13" name="Picture 13"/>
+            <wp:cNvGraphicFramePr>
+              <a:graphicFrameLocks noChangeAspect="1"/>
+            </wp:cNvGraphicFramePr>
+            <a:graphic>
+              <a:graphicData uri="http://schemas.openxmlformats.org/drawingml/2006/picture">
+                <pic:pic>
+                  <pic:nvPicPr>
+                    <pic:cNvPr id="0" name="17-quiz-gameplay-sequence.png"/>
+                    <pic:cNvPicPr/>
+                  </pic:nvPicPr>
+                  <pic:blipFill>
+                    <a:blip r:embed="rId21"/>
+                    <a:stretch>
+                      <a:fillRect/>
+                    </a:stretch>
+                  </pic:blipFill>
+                  <pic:spPr>
+                    <a:xfrm>
+                      <a:off x="0" y="0"/>
+                      <a:ext cx="5303520" cy="5004622"/>
+                    </a:xfrm>
+                    <a:prstGeom prst="rect"/>
+                  </pic:spPr>
+                </pic:pic>
+              </a:graphicData>
+            </a:graphic>
+          </wp:inline>
+        </w:drawing>
+      </w:r>
+    </w:p>
+    <w:p/>
     <w:p>
       <w:r>
         <w:t xml:space="preserve">When a quiz is completed, </w:t>
@@ -21614,6 +22078,46 @@
     </w:p>
     <w:p>
       <w:pPr>
+        <w:jc w:val="center"/>
+      </w:pPr>
+      <w:r>
+        <w:drawing>
+          <wp:inline xmlns:a="http://schemas.openxmlformats.org/drawingml/2006/main" xmlns:pic="http://schemas.openxmlformats.org/drawingml/2006/picture">
+            <wp:extent cx="5303520" cy="3728558"/>
+            <wp:docPr id="14" name="Picture 14"/>
+            <wp:cNvGraphicFramePr>
+              <a:graphicFrameLocks noChangeAspect="1"/>
+            </wp:cNvGraphicFramePr>
+            <a:graphic>
+              <a:graphicData uri="http://schemas.openxmlformats.org/drawingml/2006/picture">
+                <pic:pic>
+                  <pic:nvPicPr>
+                    <pic:cNvPr id="0" name="11-auth-sequence.png"/>
+                    <pic:cNvPicPr/>
+                  </pic:nvPicPr>
+                  <pic:blipFill>
+                    <a:blip r:embed="rId13"/>
+                    <a:stretch>
+                      <a:fillRect/>
+                    </a:stretch>
+                  </pic:blipFill>
+                  <pic:spPr>
+                    <a:xfrm>
+                      <a:off x="0" y="0"/>
+                      <a:ext cx="5303520" cy="3728558"/>
+                    </a:xfrm>
+                    <a:prstGeom prst="rect"/>
+                  </pic:spPr>
+                </pic:pic>
+              </a:graphicData>
+            </a:graphic>
+          </wp:inline>
+        </w:drawing>
+      </w:r>
+    </w:p>
+    <w:p/>
+    <w:p>
+      <w:pPr>
         <w:pStyle w:val="Heading3"/>
       </w:pPr>
       <w:r>
@@ -23400,6 +23904,46 @@
         <w:t>5.22 Document Ingestion Pipeline</w:t>
       </w:r>
     </w:p>
+    <w:p>
+      <w:pPr>
+        <w:jc w:val="center"/>
+      </w:pPr>
+      <w:r>
+        <w:drawing>
+          <wp:inline xmlns:a="http://schemas.openxmlformats.org/drawingml/2006/main" xmlns:pic="http://schemas.openxmlformats.org/drawingml/2006/picture">
+            <wp:extent cx="5303520" cy="15544057"/>
+            <wp:docPr id="15" name="Picture 15"/>
+            <wp:cNvGraphicFramePr>
+              <a:graphicFrameLocks noChangeAspect="1"/>
+            </wp:cNvGraphicFramePr>
+            <a:graphic>
+              <a:graphicData uri="http://schemas.openxmlformats.org/drawingml/2006/picture">
+                <pic:pic>
+                  <pic:nvPicPr>
+                    <pic:cNvPr id="0" name="14-ingestion-activity.png"/>
+                    <pic:cNvPicPr/>
+                  </pic:nvPicPr>
+                  <pic:blipFill>
+                    <a:blip r:embed="rId17"/>
+                    <a:stretch>
+                      <a:fillRect/>
+                    </a:stretch>
+                  </pic:blipFill>
+                  <pic:spPr>
+                    <a:xfrm>
+                      <a:off x="0" y="0"/>
+                      <a:ext cx="5303520" cy="15544057"/>
+                    </a:xfrm>
+                    <a:prstGeom prst="rect"/>
+                  </pic:spPr>
+                </pic:pic>
+              </a:graphicData>
+            </a:graphic>
+          </wp:inline>
+        </w:drawing>
+      </w:r>
+    </w:p>
+    <w:p/>
     <w:p>
       <w:r>
         <w:t>The ingestion route (</w:t>
@@ -28116,148 +28660,44 @@
     </w:p>
     <w:p>
       <w:pPr>
-        <w:pStyle w:val="NoSpacing"/>
-        <w:spacing w:before="40" w:after="40"/>
-        <w:ind w:left="567"/>
-      </w:pPr>
-      <w:r>
-        <w:rPr>
-          <w:rFonts w:ascii="Consolas" w:hAnsi="Consolas"/>
-          <w:color w:val="1E1E1E"/>
-          <w:sz w:val="17"/>
-          <w:shd w:val="clear" w:fill="F5F5F5"/>
-        </w:rPr>
-        <w:t>┌─────────────────────────────────────────────────────────────────────────────┐</w:t>
-        <w:br/>
-        <w:t>│                              CLIENT LAYER                                    │</w:t>
-        <w:br/>
-        <w:t>│                                                                             │</w:t>
-        <w:br/>
-        <w:t>│   ┌─────────────────────────────────────────────────────────────────────┐   │</w:t>
-        <w:br/>
-        <w:t>│   │                    Next.js Frontend (Port 3000)                      │   │</w:t>
-        <w:br/>
-        <w:t>│   │                                                                     │   │</w:t>
-        <w:br/>
-        <w:t>│   │   ┌──────────┐  ┌──────────┐  ┌──────────┐  ┌──────────────────┐   │   │</w:t>
-        <w:br/>
-        <w:t>│   │   │  Pages   │  │Components│  │  Store   │  │  Service Worker  │   │   │</w:t>
-        <w:br/>
-        <w:t>│   │   │(SSR/CSR) │  │ (React)  │  │(Zustand) │  │  (PWA Cache)     │   │   │</w:t>
-        <w:br/>
-        <w:t>│   │   └──────────┘  └──────────┘  └──────────┘  └──────────────────┘   │   │</w:t>
-        <w:br/>
-        <w:t>│   │                                                                     │   │</w:t>
-        <w:br/>
-        <w:t>│   │   ┌─────────────────────────────────────────────────────────────┐   │   │</w:t>
-        <w:br/>
-        <w:t>│   │   │              BFF API Routes (/api/*)                         │   │   │</w:t>
-        <w:br/>
-        <w:t>│   │   │   Token verification │ Secret injection │ Request proxying   │   │   │</w:t>
-        <w:br/>
-        <w:t>│   │   └─────────────────────────────────────────────────────────────┘   │   │</w:t>
-        <w:br/>
-        <w:t>│   └─────────────────────────────────────────────────────────────────────┘   │</w:t>
-        <w:br/>
-        <w:t>│                                                                             │</w:t>
-        <w:br/>
-        <w:t>└───────────────────────┬──────────────────────┬──────────────────────────────┘</w:t>
-        <w:br/>
-        <w:t xml:space="preserve">                        │ REST                  │ WebSocket</w:t>
-        <w:br/>
-        <w:t xml:space="preserve">                        ▼                       ▼</w:t>
-        <w:br/>
-        <w:t>┌─────────────────────────────────┐  ┌──────────────────────────────────────┐</w:t>
-        <w:br/>
-        <w:t>│    SERVICE LAYER                │  │    AI SERVICE LAYER                   │</w:t>
-        <w:br/>
-        <w:t>│                                 │  │                                      │</w:t>
-        <w:br/>
-        <w:t>│  Spring Boot Backend (8080)     │  │  FastAPI AI Coach (8000)             │</w:t>
-        <w:br/>
-        <w:t>│                                 │  │                                      │</w:t>
-        <w:br/>
-        <w:t>│  ┌───────────────────────────┐  │  │  ┌──────────────────────────────┐   │</w:t>
-        <w:br/>
-        <w:t>│  │ Controllers               │  │  │  │ WebSocket Handler            │   │</w:t>
-        <w:br/>
-        <w:t>│  │ Quiz│Question│TakeQuiz    │  │  │  │ (Streaming Chat)             │   │</w:t>
-        <w:br/>
-        <w:t>│  │ Review│Notification│User  │  │  │  └──────────────────────────────┘   │</w:t>
-        <w:br/>
-        <w:t>│  └───────────────────────────┘  │  │                                      │</w:t>
-        <w:br/>
-        <w:t>│  ┌───────────────────────────┐  │  │  ┌──────────────────────────────┐   │</w:t>
-        <w:br/>
-        <w:t>│  │ Services                  │  │  │  │ Router → Capabilities        │   │</w:t>
-        <w:br/>
-        <w:t>│  │ Business logic + Webhook  │  │  │  │ Chat│Agentic│LiteOrchestrator│   │</w:t>
-        <w:br/>
-        <w:t>│  └───────────────────────────┘  │  │  └──────────────────────────────┘   │</w:t>
-        <w:br/>
-        <w:t>│  ┌───────────────────────────┐  │  │  ┌──────────────────────────────┐   │</w:t>
-        <w:br/>
-        <w:t>│  │ Models (Firestore)        │  │  │  │ Tools                        │   │</w:t>
-        <w:br/>
-        <w:t>│  │ Quiz│Question│Review etc. │  │  │  │ History│RAG│Search│Reason    │   │</w:t>
-        <w:br/>
-        <w:t>│  └───────────────────────────┘  │  │  └──────────────────────────────┘   │</w:t>
-        <w:br/>
-        <w:t>│                                 │  │  ┌──────────────────────────────┐   │</w:t>
-        <w:br/>
-        <w:t>│                                 │  │  │ Routes (REST)                │   │</w:t>
-        <w:br/>
-        <w:t>│                                 │  │  │ /ingest │ /generate │/webhook│   │</w:t>
-        <w:br/>
-        <w:t>│                                 │  │  └──────────────────────────────┘   │</w:t>
-        <w:br/>
-        <w:t>│                                 │  │  ┌──────────────────────────────┐   │</w:t>
-        <w:br/>
-        <w:t>│                                 │  │  │ Learning                     │   │</w:t>
-        <w:br/>
-        <w:t>│                                 │  │  │ SM-2│Progress│Scheduler      │   │</w:t>
-        <w:br/>
-        <w:t>│                                 │  │  └──────────────────────────────┘   │</w:t>
-        <w:br/>
-        <w:t>└────────────────┬────────────────┘  └──────────┬────────────┬─────────────┘</w:t>
-        <w:br/>
-        <w:t xml:space="preserve">                 │                               │            │</w:t>
-        <w:br/>
-        <w:t xml:space="preserve">                 ▼                               ▼            ▼</w:t>
-        <w:br/>
-        <w:t>┌─────────────────────────────────┐  ┌───────────────┐  ┌────────────────┐</w:t>
-        <w:br/>
-        <w:t>│         DATA LAYER              │  │  VECTOR LAYER │  │   LLM LAYER    │</w:t>
-        <w:br/>
-        <w:t>│                                 │  │               │  │                │</w:t>
-        <w:br/>
-        <w:t>│  Google Cloud Firestore         │  │  Supabase     │  │  LM Studio     │</w:t>
-        <w:br/>
-        <w:t>│  ├── quizzes                    │  │  pgvector     │  │  (Local, 1234) │</w:t>
-        <w:br/>
-        <w:t>│  ├── questions                  │  │               │  │                │</w:t>
-        <w:br/>
-        <w:t>│  ├── take_quizzes               │  │  ┌─────────┐ │  │  DeepSeek API  │</w:t>
-        <w:br/>
-        <w:t>│  ├── take_questions             │  │  │documents│ │  │  (Cloud)       │</w:t>
-        <w:br/>
-        <w:t>│  ├── review_schedule            │  │  │embedding│ │  │                │</w:t>
-        <w:br/>
-        <w:t>│  ├── notifications              │  │  │kb_id    │ │  │  DuckDuckGo    │</w:t>
-        <w:br/>
-        <w:t>│  ├── users                      │  │  └─────────┘ │  │  (Web Search)  │</w:t>
-        <w:br/>
-        <w:t>│  └── users/{uid}/documents      │  │               │  │                │</w:t>
-        <w:br/>
-        <w:t>│                                 │  │               │  │                │</w:t>
-        <w:br/>
-        <w:t>│  Firebase Authentication        │  │               │  │                │</w:t>
-        <w:br/>
-        <w:t>│  (JWT tokens, OAuth providers)  │  │               │  │                │</w:t>
-        <w:br/>
-        <w:t>└─────────────────────────────────┘  └───────────────┘  └────────────────┘</w:t>
-      </w:r>
-    </w:p>
+        <w:jc w:val="center"/>
+      </w:pPr>
+      <w:r>
+        <w:drawing>
+          <wp:inline xmlns:a="http://schemas.openxmlformats.org/drawingml/2006/main" xmlns:pic="http://schemas.openxmlformats.org/drawingml/2006/picture">
+            <wp:extent cx="5029200" cy="1809493"/>
+            <wp:docPr id="16" name="Picture 16"/>
+            <wp:cNvGraphicFramePr>
+              <a:graphicFrameLocks noChangeAspect="1"/>
+            </wp:cNvGraphicFramePr>
+            <a:graphic>
+              <a:graphicData uri="http://schemas.openxmlformats.org/drawingml/2006/picture">
+                <pic:pic>
+                  <pic:nvPicPr>
+                    <pic:cNvPr id="0" name="01-high-level-architecture.png"/>
+                    <pic:cNvPicPr/>
+                  </pic:nvPicPr>
+                  <pic:blipFill>
+                    <a:blip r:embed="rId22"/>
+                    <a:stretch>
+                      <a:fillRect/>
+                    </a:stretch>
+                  </pic:blipFill>
+                  <pic:spPr>
+                    <a:xfrm>
+                      <a:off x="0" y="0"/>
+                      <a:ext cx="5029200" cy="1809493"/>
+                    </a:xfrm>
+                    <a:prstGeom prst="rect"/>
+                  </pic:spPr>
+                </pic:pic>
+              </a:graphicData>
+            </a:graphic>
+          </wp:inline>
+        </w:drawing>
+      </w:r>
+    </w:p>
+    <w:p/>
     <w:p>
       <w:pPr>
         <w:pStyle w:val="Heading2"/>
@@ -28268,72 +28708,44 @@
     </w:p>
     <w:p>
       <w:pPr>
-        <w:pStyle w:val="NoSpacing"/>
-        <w:spacing w:before="40" w:after="40"/>
-        <w:ind w:left="567"/>
-      </w:pPr>
-      <w:r>
-        <w:rPr>
-          <w:rFonts w:ascii="Consolas" w:hAnsi="Consolas"/>
-          <w:color w:val="1E1E1E"/>
-          <w:sz w:val="17"/>
-          <w:shd w:val="clear" w:fill="F5F5F5"/>
-        </w:rPr>
-        <w:t>Client                    AI Coach (FastAPI)              LLM Provider</w:t>
-        <w:br/>
-        <w:t xml:space="preserve">  │                            │                              │</w:t>
-        <w:br/>
-        <w:t xml:space="preserve">  │─── WebSocket Connect ─────►│                              │</w:t>
-        <w:br/>
-        <w:t xml:space="preserve">  │◄── Connection Accepted ────│                              │</w:t>
-        <w:br/>
-        <w:t xml:space="preserve">  │                            │                              │</w:t>
-        <w:br/>
-        <w:t xml:space="preserve">  │─── session_start ─────────►│                              │</w:t>
-        <w:br/>
-        <w:t xml:space="preserve">  │    {tier, mode, user_id}   │                              │</w:t>
-        <w:br/>
-        <w:t xml:space="preserve">  │◄── session_ack ───────────│                              │</w:t>
-        <w:br/>
-        <w:t xml:space="preserve">  │    {tools, session_id}     │                              │</w:t>
-        <w:br/>
-        <w:t xml:space="preserve">  │                            │                              │</w:t>
-        <w:br/>
-        <w:t xml:space="preserve">  │─── user_message ──────────►│                              │</w:t>
-        <w:br/>
-        <w:t xml:space="preserve">  │    "What are my weaknesses?"│                              │</w:t>
-        <w:br/>
-        <w:t xml:space="preserve">  │                            │─── POST /chat/completions ──►│</w:t>
-        <w:br/>
-        <w:t xml:space="preserve">  │◄── stage(thinking,start) ──│                              │</w:t>
-        <w:br/>
-        <w:t xml:space="preserve">  │                            │◄── tool_call: quiz_history ──│</w:t>
-        <w:br/>
-        <w:t xml:space="preserve">  │◄── tool(quiz_history,call)─│                              │</w:t>
-        <w:br/>
-        <w:t xml:space="preserve">  │                            │── Execute tool ──►           │</w:t>
-        <w:br/>
-        <w:t xml:space="preserve">  │◄── tool(quiz_history,ok) ──│                              │</w:t>
-        <w:br/>
-        <w:t xml:space="preserve">  │                            │                              │</w:t>
-        <w:br/>
-        <w:t xml:space="preserve">  │                            │─── POST (with tool result) ─►│</w:t>
-        <w:br/>
-        <w:t xml:space="preserve">  │◄── stage(thinking,end) ───│                              │</w:t>
-        <w:br/>
-        <w:t xml:space="preserve">  │◄── content("Based") ──────│◄── stream chunk ─────────────│</w:t>
-        <w:br/>
-        <w:t xml:space="preserve">  │◄── content(" on") ────────│◄── stream chunk ─────────────│</w:t>
-        <w:br/>
-        <w:t xml:space="preserve">  │◄── content(" your") ──────│◄── stream chunk ─────────────│</w:t>
-        <w:br/>
-        <w:t xml:space="preserve">  │     ...                    │     ...                       │</w:t>
-        <w:br/>
-        <w:t xml:space="preserve">  │◄── done ──────────────────│                              │</w:t>
-        <w:br/>
-        <w:t xml:space="preserve">  │                            │                              │</w:t>
-      </w:r>
-    </w:p>
+        <w:jc w:val="center"/>
+      </w:pPr>
+      <w:r>
+        <w:drawing>
+          <wp:inline xmlns:a="http://schemas.openxmlformats.org/drawingml/2006/main" xmlns:pic="http://schemas.openxmlformats.org/drawingml/2006/picture">
+            <wp:extent cx="5029200" cy="5646392"/>
+            <wp:docPr id="17" name="Picture 17"/>
+            <wp:cNvGraphicFramePr>
+              <a:graphicFrameLocks noChangeAspect="1"/>
+            </wp:cNvGraphicFramePr>
+            <a:graphic>
+              <a:graphicData uri="http://schemas.openxmlformats.org/drawingml/2006/picture">
+                <pic:pic>
+                  <pic:nvPicPr>
+                    <pic:cNvPr id="0" name="02-websocket-sequence.png"/>
+                    <pic:cNvPicPr/>
+                  </pic:nvPicPr>
+                  <pic:blipFill>
+                    <a:blip r:embed="rId23"/>
+                    <a:stretch>
+                      <a:fillRect/>
+                    </a:stretch>
+                  </pic:blipFill>
+                  <pic:spPr>
+                    <a:xfrm>
+                      <a:off x="0" y="0"/>
+                      <a:ext cx="5029200" cy="5646392"/>
+                    </a:xfrm>
+                    <a:prstGeom prst="rect"/>
+                  </pic:spPr>
+                </pic:pic>
+              </a:graphicData>
+            </a:graphic>
+          </wp:inline>
+        </w:drawing>
+      </w:r>
+    </w:p>
+    <w:p/>
     <w:p>
       <w:pPr>
         <w:pStyle w:val="Heading2"/>
@@ -28344,62 +28756,44 @@
     </w:p>
     <w:p>
       <w:pPr>
-        <w:pStyle w:val="NoSpacing"/>
-        <w:spacing w:before="40" w:after="40"/>
-        <w:ind w:left="567"/>
-      </w:pPr>
-      <w:r>
-        <w:rPr>
-          <w:rFonts w:ascii="Consolas" w:hAnsi="Consolas"/>
-          <w:color w:val="1E1E1E"/>
-          <w:sz w:val="17"/>
-          <w:shd w:val="clear" w:fill="F5F5F5"/>
-        </w:rPr>
-        <w:t>Student              Frontend           Spring Boot        AI Coach</w:t>
-        <w:br/>
-        <w:t xml:space="preserve">  │                    │                    │                  │</w:t>
-        <w:br/>
-        <w:t xml:space="preserve">  │── Submit Answer ──►│                    │                  │</w:t>
-        <w:br/>
-        <w:t xml:space="preserve">  │                    │── POST answer ────►│                  │</w:t>
-        <w:br/>
-        <w:t xml:space="preserve">  │                    │                    │── Validate ──►   │</w:t>
-        <w:br/>
-        <w:t xml:space="preserve">  │                    │                    │── Save result    │</w:t>
-        <w:br/>
-        <w:t xml:space="preserve">  │                    │                    │── Compute score  │</w:t>
-        <w:br/>
-        <w:t xml:space="preserve">  │                    │◄── Score response ─│                  │</w:t>
-        <w:br/>
-        <w:t xml:space="preserve">  │◄── Show results ──│                    │                  │</w:t>
-        <w:br/>
-        <w:t xml:space="preserve">  │                    │                    │                  │</w:t>
-        <w:br/>
-        <w:t xml:space="preserve">  │                    │                    │── POST webhook ─►│</w:t>
-        <w:br/>
-        <w:t xml:space="preserve">  │                    │                    │   {user_id,      │</w:t>
-        <w:br/>
-        <w:t xml:space="preserve">  │                    │                    │    category,     │</w:t>
-        <w:br/>
-        <w:t xml:space="preserve">  │                    │                    │    score,        │</w:t>
-        <w:br/>
-        <w:t xml:space="preserve">  │                    │                    │    questions}    │</w:t>
-        <w:br/>
-        <w:t xml:space="preserve">  │                    │                    │                  │</w:t>
-        <w:br/>
-        <w:t xml:space="preserve">  │                    │                    │                  │── Apply SM-2</w:t>
-        <w:br/>
-        <w:t xml:space="preserve">  │                    │                    │                  │── Update schedule</w:t>
-        <w:br/>
-        <w:t xml:space="preserve">  │                    │                    │◄── PUT schedule ─│</w:t>
-        <w:br/>
-        <w:t xml:space="preserve">  │                    │                    │                  │── Check if review due</w:t>
-        <w:br/>
-        <w:t xml:space="preserve">  │                    │                    │◄── POST notif ──│ (if due soon)</w:t>
-        <w:br/>
-        <w:t xml:space="preserve">  │                    │                    │                  │</w:t>
-      </w:r>
-    </w:p>
+        <w:jc w:val="center"/>
+      </w:pPr>
+      <w:r>
+        <w:drawing>
+          <wp:inline xmlns:a="http://schemas.openxmlformats.org/drawingml/2006/main" xmlns:pic="http://schemas.openxmlformats.org/drawingml/2006/picture">
+            <wp:extent cx="5029200" cy="4794290"/>
+            <wp:docPr id="18" name="Picture 18"/>
+            <wp:cNvGraphicFramePr>
+              <a:graphicFrameLocks noChangeAspect="1"/>
+            </wp:cNvGraphicFramePr>
+            <a:graphic>
+              <a:graphicData uri="http://schemas.openxmlformats.org/drawingml/2006/picture">
+                <pic:pic>
+                  <pic:nvPicPr>
+                    <pic:cNvPr id="0" name="03-webhook-flow.png"/>
+                    <pic:cNvPicPr/>
+                  </pic:nvPicPr>
+                  <pic:blipFill>
+                    <a:blip r:embed="rId24"/>
+                    <a:stretch>
+                      <a:fillRect/>
+                    </a:stretch>
+                  </pic:blipFill>
+                  <pic:spPr>
+                    <a:xfrm>
+                      <a:off x="0" y="0"/>
+                      <a:ext cx="5029200" cy="4794290"/>
+                    </a:xfrm>
+                    <a:prstGeom prst="rect"/>
+                  </pic:spPr>
+                </pic:pic>
+              </a:graphicData>
+            </a:graphic>
+          </wp:inline>
+        </w:drawing>
+      </w:r>
+    </w:p>
+    <w:p/>
     <w:p>
       <w:pPr>
         <w:pStyle w:val="Heading2"/>
@@ -28410,62 +28804,44 @@
     </w:p>
     <w:p>
       <w:pPr>
-        <w:pStyle w:val="NoSpacing"/>
-        <w:spacing w:before="40" w:after="40"/>
-        <w:ind w:left="567"/>
-      </w:pPr>
-      <w:r>
-        <w:rPr>
-          <w:rFonts w:ascii="Consolas" w:hAnsi="Consolas"/>
-          <w:color w:val="1E1E1E"/>
-          <w:sz w:val="17"/>
-          <w:shd w:val="clear" w:fill="F5F5F5"/>
-        </w:rPr>
-        <w:t>┌──────────┐     ┌──────────┐     ┌──────────┐     ┌──────────┐     ┌──────────┐</w:t>
-        <w:br/>
-        <w:t>│  Upload  │────►│ Extract  │────►│ Validate │────►│  Chunk   │────►│  Embed   │</w:t>
-        <w:br/>
-        <w:t>│  (File)  │     │  (Text)  │     │(Quality) │     │(500/50)  │     │(768-dim) │</w:t>
-        <w:br/>
-        <w:t>└──────────┘     └──────────┘     └──────────┘     └──────────┘     └────┬─────┘</w:t>
-        <w:br/>
-        <w:t xml:space="preserve">                                       │                                   │</w:t>
-        <w:br/>
-        <w:t xml:space="preserve">                                       │ FAIL                              ▼</w:t>
-        <w:br/>
-        <w:t xml:space="preserve">                                       ▼                            ┌──────────┐</w:t>
-        <w:br/>
-        <w:t xml:space="preserve">                                  HTTP 400                          │  Store   │</w:t>
-        <w:br/>
-        <w:t xml:space="preserve">                                  "Image-only"                      │(Supabase)│</w:t>
-        <w:br/>
-        <w:t xml:space="preserve">                                                                    └──────────┘</w:t>
-        <w:br/>
-        <w:br/>
-        <w:t>--- During Chat/Generation ---</w:t>
-        <w:br/>
-        <w:br/>
-        <w:t>┌──────────┐     ┌──────────┐     ┌──────────┐     ┌──────────┐     ┌──────────┐</w:t>
-        <w:br/>
-        <w:t>│  Query   │────►│  Embed   │────►│  Search  │────►│  Top-K   │────►│  Inject  │</w:t>
-        <w:br/>
-        <w:t>│  (User)  │     │  Query   │     │(Cosine)  │     │ Results  │     │(Context) │</w:t>
-        <w:br/>
-        <w:t>└──────────┘     └──────────┘     └──────────┘     └──────────┘     └────┬─────┘</w:t>
-        <w:br/>
-        <w:t xml:space="preserve">                                                                          │</w:t>
-        <w:br/>
-        <w:t xml:space="preserve">                                                                          ▼</w:t>
-        <w:br/>
-        <w:t xml:space="preserve">                                                                    ┌──────────┐</w:t>
-        <w:br/>
-        <w:t xml:space="preserve">                                                                    │   LLM    │</w:t>
-        <w:br/>
-        <w:t xml:space="preserve">                                                                    │(Generate)│</w:t>
-        <w:br/>
-        <w:t xml:space="preserve">                                                                    └──────────┘</w:t>
-      </w:r>
-    </w:p>
+        <w:jc w:val="center"/>
+      </w:pPr>
+      <w:r>
+        <w:drawing>
+          <wp:inline xmlns:a="http://schemas.openxmlformats.org/drawingml/2006/main" xmlns:pic="http://schemas.openxmlformats.org/drawingml/2006/picture">
+            <wp:extent cx="5029200" cy="1975150"/>
+            <wp:docPr id="19" name="Picture 19"/>
+            <wp:cNvGraphicFramePr>
+              <a:graphicFrameLocks noChangeAspect="1"/>
+            </wp:cNvGraphicFramePr>
+            <a:graphic>
+              <a:graphicData uri="http://schemas.openxmlformats.org/drawingml/2006/picture">
+                <pic:pic>
+                  <pic:nvPicPr>
+                    <pic:cNvPr id="0" name="04-rag-pipeline.png"/>
+                    <pic:cNvPicPr/>
+                  </pic:nvPicPr>
+                  <pic:blipFill>
+                    <a:blip r:embed="rId25"/>
+                    <a:stretch>
+                      <a:fillRect/>
+                    </a:stretch>
+                  </pic:blipFill>
+                  <pic:spPr>
+                    <a:xfrm>
+                      <a:off x="0" y="0"/>
+                      <a:ext cx="5029200" cy="1975150"/>
+                    </a:xfrm>
+                    <a:prstGeom prst="rect"/>
+                  </pic:spPr>
+                </pic:pic>
+              </a:graphicData>
+            </a:graphic>
+          </wp:inline>
+        </w:drawing>
+      </w:r>
+    </w:p>
+    <w:p/>
     <w:p>
       <w:pPr>
         <w:pStyle w:val="Heading2"/>
@@ -28476,93 +28852,44 @@
     </w:p>
     <w:p>
       <w:pPr>
-        <w:pStyle w:val="NoSpacing"/>
-        <w:spacing w:before="40" w:after="40"/>
-        <w:ind w:left="567"/>
-      </w:pPr>
-      <w:r>
-        <w:rPr>
-          <w:rFonts w:ascii="Consolas" w:hAnsi="Consolas"/>
-          <w:color w:val="1E1E1E"/>
-          <w:sz w:val="17"/>
-          <w:shd w:val="clear" w:fill="F5F5F5"/>
-        </w:rPr>
-        <w:t xml:space="preserve">                    ┌─────────────────┐</w:t>
-        <w:br/>
-        <w:t xml:space="preserve">                    │   NEW CATEGORY  │</w:t>
-        <w:br/>
-        <w:t xml:space="preserve">                    │   EF=2.5, R=0   │</w:t>
-        <w:br/>
-        <w:t xml:space="preserve">                    └────────┬────────┘</w:t>
-        <w:br/>
-        <w:t xml:space="preserve">                             │ First quiz completed</w:t>
-        <w:br/>
-        <w:t xml:space="preserve">                             ▼</w:t>
-        <w:br/>
-        <w:t xml:space="preserve">              ┌──────────────────────────────┐</w:t>
-        <w:br/>
-        <w:t xml:space="preserve">              │                              │</w:t>
-        <w:br/>
-        <w:t xml:space="preserve">         Pass (Q≥3)                     Fail (Q&lt;3)</w:t>
-        <w:br/>
-        <w:t xml:space="preserve">              │                              │</w:t>
-        <w:br/>
-        <w:t xml:space="preserve">              ▼                              ▼</w:t>
-        <w:br/>
-        <w:t xml:space="preserve">    ┌─────────────────┐          ┌─────────────────┐</w:t>
-        <w:br/>
-        <w:t xml:space="preserve">    │   LEARNING      │          │   RELEARNING    │</w:t>
-        <w:br/>
-        <w:t xml:space="preserve">    │   R=1, I=1 day  │          │   R=0, I=0.5 day│</w:t>
-        <w:br/>
-        <w:t xml:space="preserve">    └────────┬────────┘          └────────┬────────┘</w:t>
-        <w:br/>
-        <w:t xml:space="preserve">             │ Pass                        │ Pass</w:t>
-        <w:br/>
-        <w:t xml:space="preserve">             ▼                             │</w:t>
-        <w:br/>
-        <w:t xml:space="preserve">    ┌─────────────────┐                    │</w:t>
-        <w:br/>
-        <w:t xml:space="preserve">    │   LEARNING      │◄───────────────────┘</w:t>
-        <w:br/>
-        <w:t xml:space="preserve">    │   R=2, I=3 days │</w:t>
-        <w:br/>
-        <w:t xml:space="preserve">    └────────┬────────┘</w:t>
-        <w:br/>
-        <w:t xml:space="preserve">             │ Pass</w:t>
-        <w:br/>
-        <w:t xml:space="preserve">             ▼</w:t>
-        <w:br/>
-        <w:t xml:space="preserve">    ┌─────────────────┐</w:t>
-        <w:br/>
-        <w:t xml:space="preserve">    │   REVIEW        │◄──── Pass ────┐</w:t>
-        <w:br/>
-        <w:t xml:space="preserve">    │   R=n, I=I×EF   │               │</w:t>
-        <w:br/>
-        <w:t xml:space="preserve">    └────────┬────────┘               │</w:t>
-        <w:br/>
-        <w:t xml:space="preserve">             │                         │</w:t>
-        <w:br/>
-        <w:t xml:space="preserve">        Pass │    Fail                 │</w:t>
-        <w:br/>
-        <w:t xml:space="preserve">             │      │                  │</w:t>
-        <w:br/>
-        <w:t xml:space="preserve">             └──────┤                  │</w:t>
-        <w:br/>
-        <w:t xml:space="preserve">                    ▼                  │</w:t>
-        <w:br/>
-        <w:t xml:space="preserve">          ┌─────────────────┐         │</w:t>
-        <w:br/>
-        <w:t xml:space="preserve">          │   RELAPSE       │── Pass ─┘</w:t>
-        <w:br/>
-        <w:t xml:space="preserve">          │   R=0, I=0.5 day│</w:t>
-        <w:br/>
-        <w:t xml:space="preserve">          └─────────────────┘</w:t>
-        <w:br/>
-        <w:br/>
-        <w:t>Legend: EF = Easiness Factor, R = Repetitions, I = Interval, Q = Quality</w:t>
-      </w:r>
-    </w:p>
+        <w:jc w:val="center"/>
+      </w:pPr>
+      <w:r>
+        <w:drawing>
+          <wp:inline xmlns:a="http://schemas.openxmlformats.org/drawingml/2006/main" xmlns:pic="http://schemas.openxmlformats.org/drawingml/2006/picture">
+            <wp:extent cx="5029200" cy="7703626"/>
+            <wp:docPr id="20" name="Picture 20"/>
+            <wp:cNvGraphicFramePr>
+              <a:graphicFrameLocks noChangeAspect="1"/>
+            </wp:cNvGraphicFramePr>
+            <a:graphic>
+              <a:graphicData uri="http://schemas.openxmlformats.org/drawingml/2006/picture">
+                <pic:pic>
+                  <pic:nvPicPr>
+                    <pic:cNvPr id="0" name="05-sm2-state-machine.png"/>
+                    <pic:cNvPicPr/>
+                  </pic:nvPicPr>
+                  <pic:blipFill>
+                    <a:blip r:embed="rId26"/>
+                    <a:stretch>
+                      <a:fillRect/>
+                    </a:stretch>
+                  </pic:blipFill>
+                  <pic:spPr>
+                    <a:xfrm>
+                      <a:off x="0" y="0"/>
+                      <a:ext cx="5029200" cy="7703626"/>
+                    </a:xfrm>
+                    <a:prstGeom prst="rect"/>
+                  </pic:spPr>
+                </pic:pic>
+              </a:graphicData>
+            </a:graphic>
+          </wp:inline>
+        </w:drawing>
+      </w:r>
+    </w:p>
+    <w:p/>
     <w:p>
       <w:r>
         <w:br w:type="page"/>

</xml_diff>